<commit_message>
06-06-25 : début nmds et fin glmm
</commit_message>
<xml_diff>
--- a/Data/Data placettes/DATA_placette_CANOPIX/metriques_CB/catalogue_metric_insect.docx
+++ b/Data/Data placettes/DATA_placette_CANOPIX/metriques_CB/catalogue_metric_insect.docx
@@ -10,8 +10,6 @@
           <w:szCs w:val="20"/>
         </w:rPr>
       </w:pPr>
-      <w:bookmarkStart w:id="0" w:name="_GoBack"/>
-      <w:bookmarkEnd w:id="0"/>
       <w:r>
         <w:rPr>
           <w:sz w:val="24"/>
@@ -33,21 +31,53 @@
           <w:sz w:val="24"/>
           <w:szCs w:val="20"/>
         </w:rPr>
-        <w:t>– dataset 2024 Vierzon-Troncais – thèse RB</w:t>
-      </w:r>
-    </w:p>
-    <w:p>
-      <w:pPr>
+        <w:t xml:space="preserve">– </w:t>
+      </w:r>
+      <w:proofErr w:type="spellStart"/>
+      <w:r>
         <w:rPr>
           <w:sz w:val="24"/>
           <w:szCs w:val="20"/>
         </w:rPr>
-      </w:pPr>
+        <w:t>dataset</w:t>
+      </w:r>
+      <w:proofErr w:type="spellEnd"/>
       <w:r>
         <w:rPr>
           <w:sz w:val="24"/>
           <w:szCs w:val="20"/>
         </w:rPr>
+        <w:t xml:space="preserve"> 2024 Vierzon-</w:t>
+      </w:r>
+      <w:proofErr w:type="spellStart"/>
+      <w:r>
+        <w:rPr>
+          <w:sz w:val="24"/>
+          <w:szCs w:val="20"/>
+        </w:rPr>
+        <w:t>Troncais</w:t>
+      </w:r>
+      <w:proofErr w:type="spellEnd"/>
+      <w:r>
+        <w:rPr>
+          <w:sz w:val="24"/>
+          <w:szCs w:val="20"/>
+        </w:rPr>
+        <w:t xml:space="preserve"> – thèse RB</w:t>
+      </w:r>
+    </w:p>
+    <w:p>
+      <w:pPr>
+        <w:rPr>
+          <w:sz w:val="24"/>
+          <w:szCs w:val="20"/>
+        </w:rPr>
+      </w:pPr>
+      <w:r>
+        <w:rPr>
+          <w:sz w:val="24"/>
+          <w:szCs w:val="20"/>
+        </w:rPr>
         <w:t>C. Bouget</w:t>
       </w:r>
     </w:p>
@@ -84,7 +114,135 @@
           <w:sz w:val="20"/>
           <w:szCs w:val="20"/>
         </w:rPr>
-        <w:t> : manquent encore des données de retour d’identifs (Ciidae O. Rose, Elateridae scolytinae Histeridae Anobiidae Quillan, mais Scraptiidae et Mordeliidae sont revenus et saisis)</w:t>
+        <w:t> : manquent encore des données de retour d’</w:t>
+      </w:r>
+      <w:proofErr w:type="spellStart"/>
+      <w:r>
+        <w:rPr>
+          <w:sz w:val="20"/>
+          <w:szCs w:val="20"/>
+        </w:rPr>
+        <w:t>identifs</w:t>
+      </w:r>
+      <w:proofErr w:type="spellEnd"/>
+      <w:r>
+        <w:rPr>
+          <w:sz w:val="20"/>
+          <w:szCs w:val="20"/>
+        </w:rPr>
+        <w:t xml:space="preserve"> (</w:t>
+      </w:r>
+      <w:proofErr w:type="spellStart"/>
+      <w:r>
+        <w:rPr>
+          <w:sz w:val="20"/>
+          <w:szCs w:val="20"/>
+        </w:rPr>
+        <w:t>Ciidae</w:t>
+      </w:r>
+      <w:proofErr w:type="spellEnd"/>
+      <w:r>
+        <w:rPr>
+          <w:sz w:val="20"/>
+          <w:szCs w:val="20"/>
+        </w:rPr>
+        <w:t xml:space="preserve"> O. Rose, </w:t>
+      </w:r>
+      <w:proofErr w:type="spellStart"/>
+      <w:r>
+        <w:rPr>
+          <w:sz w:val="20"/>
+          <w:szCs w:val="20"/>
+        </w:rPr>
+        <w:t>Elateridae</w:t>
+      </w:r>
+      <w:proofErr w:type="spellEnd"/>
+      <w:r>
+        <w:rPr>
+          <w:sz w:val="20"/>
+          <w:szCs w:val="20"/>
+        </w:rPr>
+        <w:t xml:space="preserve"> </w:t>
+      </w:r>
+      <w:proofErr w:type="spellStart"/>
+      <w:r>
+        <w:rPr>
+          <w:sz w:val="20"/>
+          <w:szCs w:val="20"/>
+        </w:rPr>
+        <w:t>scolytinae</w:t>
+      </w:r>
+      <w:proofErr w:type="spellEnd"/>
+      <w:r>
+        <w:rPr>
+          <w:sz w:val="20"/>
+          <w:szCs w:val="20"/>
+        </w:rPr>
+        <w:t xml:space="preserve"> </w:t>
+      </w:r>
+      <w:proofErr w:type="spellStart"/>
+      <w:r>
+        <w:rPr>
+          <w:sz w:val="20"/>
+          <w:szCs w:val="20"/>
+        </w:rPr>
+        <w:t>Histeridae</w:t>
+      </w:r>
+      <w:proofErr w:type="spellEnd"/>
+      <w:r>
+        <w:rPr>
+          <w:sz w:val="20"/>
+          <w:szCs w:val="20"/>
+        </w:rPr>
+        <w:t xml:space="preserve"> </w:t>
+      </w:r>
+      <w:proofErr w:type="spellStart"/>
+      <w:r>
+        <w:rPr>
+          <w:sz w:val="20"/>
+          <w:szCs w:val="20"/>
+        </w:rPr>
+        <w:t>Anobiidae</w:t>
+      </w:r>
+      <w:proofErr w:type="spellEnd"/>
+      <w:r>
+        <w:rPr>
+          <w:sz w:val="20"/>
+          <w:szCs w:val="20"/>
+        </w:rPr>
+        <w:t xml:space="preserve"> Quillan, mais </w:t>
+      </w:r>
+      <w:proofErr w:type="spellStart"/>
+      <w:r>
+        <w:rPr>
+          <w:sz w:val="20"/>
+          <w:szCs w:val="20"/>
+        </w:rPr>
+        <w:t>Scraptiidae</w:t>
+      </w:r>
+      <w:proofErr w:type="spellEnd"/>
+      <w:r>
+        <w:rPr>
+          <w:sz w:val="20"/>
+          <w:szCs w:val="20"/>
+        </w:rPr>
+        <w:t xml:space="preserve"> et </w:t>
+      </w:r>
+      <w:proofErr w:type="spellStart"/>
+      <w:r>
+        <w:rPr>
+          <w:sz w:val="20"/>
+          <w:szCs w:val="20"/>
+        </w:rPr>
+        <w:t>Mordeliidae</w:t>
+      </w:r>
+      <w:proofErr w:type="spellEnd"/>
+      <w:r>
+        <w:rPr>
+          <w:sz w:val="20"/>
+          <w:szCs w:val="20"/>
+        </w:rPr>
+        <w:t xml:space="preserve"> sont revenus et saisis)</w:t>
       </w:r>
     </w:p>
     <w:p>
@@ -100,7 +258,25 @@
           <w:szCs w:val="20"/>
           <w:highlight w:val="yellow"/>
         </w:rPr>
-        <w:t>Calculs refaits au 22/04 (après les retours de toutes les identifs) + par saison d’échantillonnage</w:t>
+        <w:t xml:space="preserve">Calculs refaits au 22/04 (après les retours de toutes les </w:t>
+      </w:r>
+      <w:proofErr w:type="spellStart"/>
+      <w:r>
+        <w:rPr>
+          <w:sz w:val="20"/>
+          <w:szCs w:val="20"/>
+          <w:highlight w:val="yellow"/>
+        </w:rPr>
+        <w:t>identifs</w:t>
+      </w:r>
+      <w:proofErr w:type="spellEnd"/>
+      <w:r>
+        <w:rPr>
+          <w:sz w:val="20"/>
+          <w:szCs w:val="20"/>
+          <w:highlight w:val="yellow"/>
+        </w:rPr>
+        <w:t>) + par saison d’échantillonnage</w:t>
       </w:r>
     </w:p>
     <w:p>
@@ -182,7 +358,27 @@
           <w:szCs w:val="20"/>
           <w:lang w:val="en-GB"/>
         </w:rPr>
-        <w:t>(prop.trap.season) Cumulative proportion of valid traps over all the sampling seasons</w:t>
+        <w:t>(</w:t>
+      </w:r>
+      <w:proofErr w:type="spellStart"/>
+      <w:r>
+        <w:rPr>
+          <w:color w:val="FF0000"/>
+          <w:sz w:val="20"/>
+          <w:szCs w:val="20"/>
+          <w:lang w:val="en-GB"/>
+        </w:rPr>
+        <w:t>prop.trap.season</w:t>
+      </w:r>
+      <w:proofErr w:type="spellEnd"/>
+      <w:r>
+        <w:rPr>
+          <w:color w:val="FF0000"/>
+          <w:sz w:val="20"/>
+          <w:szCs w:val="20"/>
+          <w:lang w:val="en-GB"/>
+        </w:rPr>
+        <w:t>) Cumulative proportion of valid traps over all the sampling seasons</w:t>
       </w:r>
     </w:p>
     <w:p>
@@ -204,8 +400,17 @@
           <w:sz w:val="20"/>
           <w:szCs w:val="20"/>
         </w:rPr>
-        <w:t>À ajouter comme « offset » dans les glmm</w:t>
-      </w:r>
+        <w:t xml:space="preserve">À ajouter comme « offset » dans les </w:t>
+      </w:r>
+      <w:proofErr w:type="spellStart"/>
+      <w:r>
+        <w:rPr>
+          <w:sz w:val="20"/>
+          <w:szCs w:val="20"/>
+        </w:rPr>
+        <w:t>glmm</w:t>
+      </w:r>
+      <w:proofErr w:type="spellEnd"/>
       <w:r>
         <w:rPr>
           <w:sz w:val="20"/>
@@ -1043,6 +1248,7 @@
                 <w:szCs w:val="20"/>
               </w:rPr>
             </w:pPr>
+            <w:proofErr w:type="spellStart"/>
             <w:r>
               <w:rPr>
                 <w:rFonts w:ascii="Calibri" w:hAnsi="Calibri" w:cs="Calibri"/>
@@ -1052,6 +1258,7 @@
               </w:rPr>
               <w:t>intra.sup</w:t>
             </w:r>
+            <w:proofErr w:type="spellEnd"/>
           </w:p>
         </w:tc>
         <w:tc>
@@ -1547,7 +1754,23 @@
           <w:sz w:val="20"/>
           <w:szCs w:val="20"/>
         </w:rPr>
-        <w:t>Seuils (occurrence &gt;10%, abondance &gt; 50 indiv)</w:t>
+        <w:t xml:space="preserve">Seuils (occurrence &gt;10%, abondance &gt; 50 </w:t>
+      </w:r>
+      <w:proofErr w:type="spellStart"/>
+      <w:r>
+        <w:rPr>
+          <w:sz w:val="20"/>
+          <w:szCs w:val="20"/>
+        </w:rPr>
+        <w:t>indiv</w:t>
+      </w:r>
+      <w:proofErr w:type="spellEnd"/>
+      <w:r>
+        <w:rPr>
+          <w:sz w:val="20"/>
+          <w:szCs w:val="20"/>
+        </w:rPr>
+        <w:t>)</w:t>
       </w:r>
     </w:p>
     <w:p>
@@ -1581,6 +1804,8 @@
           <w:szCs w:val="20"/>
         </w:rPr>
       </w:pPr>
+      <w:proofErr w:type="spellStart"/>
+      <w:proofErr w:type="gramStart"/>
       <w:r>
         <w:rPr>
           <w:sz w:val="20"/>
@@ -1588,29 +1813,60 @@
         </w:rPr>
         <w:t>ab.colsx</w:t>
       </w:r>
+      <w:proofErr w:type="spellEnd"/>
+      <w:proofErr w:type="gramEnd"/>
       <w:r>
         <w:rPr>
           <w:sz w:val="20"/>
           <w:szCs w:val="20"/>
         </w:rPr>
         <w:tab/>
-        <w:t>Effectif cumulé par piège sur l’ensemble des relevés saisonniers des individus de coléoptères saproxyliques</w:t>
-      </w:r>
-    </w:p>
-    <w:p>
-      <w:pPr>
-        <w:rPr>
-          <w:sz w:val="20"/>
-          <w:szCs w:val="20"/>
-        </w:rPr>
-      </w:pPr>
-      <w:r>
-        <w:rPr>
-          <w:sz w:val="20"/>
-          <w:szCs w:val="20"/>
-        </w:rPr>
-        <w:t>rs.colsx  Nombre cumulé par piège sur l’ensemble des relevés saisonniers des espèces de coléoptères saproxyliques</w:t>
-      </w:r>
+        <w:t xml:space="preserve">Effectif cumulé par piège sur l’ensemble des relevés saisonniers des individus de coléoptères </w:t>
+      </w:r>
+      <w:proofErr w:type="spellStart"/>
+      <w:r>
+        <w:rPr>
+          <w:sz w:val="20"/>
+          <w:szCs w:val="20"/>
+        </w:rPr>
+        <w:t>saproxyliques</w:t>
+      </w:r>
+      <w:proofErr w:type="spellEnd"/>
+    </w:p>
+    <w:p>
+      <w:pPr>
+        <w:rPr>
+          <w:sz w:val="20"/>
+          <w:szCs w:val="20"/>
+        </w:rPr>
+      </w:pPr>
+      <w:proofErr w:type="spellStart"/>
+      <w:proofErr w:type="gramStart"/>
+      <w:r>
+        <w:rPr>
+          <w:sz w:val="20"/>
+          <w:szCs w:val="20"/>
+        </w:rPr>
+        <w:t>rs.colsx</w:t>
+      </w:r>
+      <w:proofErr w:type="spellEnd"/>
+      <w:proofErr w:type="gramEnd"/>
+      <w:r>
+        <w:rPr>
+          <w:sz w:val="20"/>
+          <w:szCs w:val="20"/>
+        </w:rPr>
+        <w:t xml:space="preserve">  Nombre cumulé par piège sur l’ensemble des relevés saisonniers des espèces de coléoptères </w:t>
+      </w:r>
+      <w:proofErr w:type="spellStart"/>
+      <w:r>
+        <w:rPr>
+          <w:sz w:val="20"/>
+          <w:szCs w:val="20"/>
+        </w:rPr>
+        <w:t>saproxyliques</w:t>
+      </w:r>
+      <w:proofErr w:type="spellEnd"/>
       <w:r>
         <w:rPr>
           <w:sz w:val="20"/>
@@ -1677,12 +1933,23 @@
           <w:szCs w:val="20"/>
         </w:rPr>
       </w:pPr>
-      <w:r>
-        <w:rPr>
-          <w:sz w:val="20"/>
-          <w:szCs w:val="20"/>
-        </w:rPr>
-        <w:t>ab.colsxrar Effectif cumulé par piège sur l’ensemble des relevés saisonniers</w:t>
+      <w:proofErr w:type="spellStart"/>
+      <w:proofErr w:type="gramStart"/>
+      <w:r>
+        <w:rPr>
+          <w:sz w:val="20"/>
+          <w:szCs w:val="20"/>
+        </w:rPr>
+        <w:t>ab.colsxrar</w:t>
+      </w:r>
+      <w:proofErr w:type="spellEnd"/>
+      <w:proofErr w:type="gramEnd"/>
+      <w:r>
+        <w:rPr>
+          <w:sz w:val="20"/>
+          <w:szCs w:val="20"/>
+        </w:rPr>
+        <w:t xml:space="preserve"> Effectif cumulé par piège sur l’ensemble des relevés saisonniers</w:t>
       </w:r>
       <w:r>
         <w:rPr>
@@ -1696,8 +1963,17 @@
           <w:sz w:val="20"/>
           <w:szCs w:val="20"/>
         </w:rPr>
-        <w:t xml:space="preserve"> coléoptères saproxyliques</w:t>
-      </w:r>
+        <w:t xml:space="preserve"> coléoptères </w:t>
+      </w:r>
+      <w:proofErr w:type="spellStart"/>
+      <w:r>
+        <w:rPr>
+          <w:sz w:val="20"/>
+          <w:szCs w:val="20"/>
+        </w:rPr>
+        <w:t>saproxyliques</w:t>
+      </w:r>
+      <w:proofErr w:type="spellEnd"/>
       <w:r>
         <w:rPr>
           <w:sz w:val="20"/>
@@ -1718,12 +1994,39 @@
           <w:szCs w:val="20"/>
         </w:rPr>
       </w:pPr>
-      <w:r>
-        <w:rPr>
-          <w:sz w:val="20"/>
-          <w:szCs w:val="20"/>
-        </w:rPr>
-        <w:t>rs.colsxrar Nombre cumulé par piège sur l’ensemble des relevés saisonniers des espèces rares de coléoptères saproxyliques (Indice Patrimonial Bouget et al. 2019 : IP = 3 ou IP =4)</w:t>
+      <w:proofErr w:type="spellStart"/>
+      <w:proofErr w:type="gramStart"/>
+      <w:r>
+        <w:rPr>
+          <w:sz w:val="20"/>
+          <w:szCs w:val="20"/>
+        </w:rPr>
+        <w:t>rs.colsxrar</w:t>
+      </w:r>
+      <w:proofErr w:type="spellEnd"/>
+      <w:proofErr w:type="gramEnd"/>
+      <w:r>
+        <w:rPr>
+          <w:sz w:val="20"/>
+          <w:szCs w:val="20"/>
+        </w:rPr>
+        <w:t xml:space="preserve"> Nombre cumulé par piège sur l’ensemble des relevés saisonniers des espèces rares de coléoptères </w:t>
+      </w:r>
+      <w:proofErr w:type="spellStart"/>
+      <w:r>
+        <w:rPr>
+          <w:sz w:val="20"/>
+          <w:szCs w:val="20"/>
+        </w:rPr>
+        <w:t>saproxyliques</w:t>
+      </w:r>
+      <w:proofErr w:type="spellEnd"/>
+      <w:r>
+        <w:rPr>
+          <w:sz w:val="20"/>
+          <w:szCs w:val="20"/>
+        </w:rPr>
+        <w:t xml:space="preserve"> (Indice Patrimonial Bouget et al. 2019 : IP = 3 ou IP =4)</w:t>
       </w:r>
     </w:p>
     <w:p>
@@ -1738,6 +2041,8 @@
           <w:szCs w:val="20"/>
         </w:rPr>
       </w:pPr>
+      <w:proofErr w:type="spellStart"/>
+      <w:proofErr w:type="gramStart"/>
       <w:r>
         <w:rPr>
           <w:sz w:val="20"/>
@@ -1745,6 +2050,8 @@
         </w:rPr>
         <w:t>ab.colsxcom</w:t>
       </w:r>
+      <w:proofErr w:type="spellEnd"/>
+      <w:proofErr w:type="gramEnd"/>
       <w:r>
         <w:rPr>
           <w:sz w:val="20"/>
@@ -1757,7 +2064,23 @@
           <w:sz w:val="20"/>
           <w:szCs w:val="20"/>
         </w:rPr>
-        <w:t>Effectif cumulé par piège sur l’ensemble des relevés saisonniers des individus d’espèces communes de coléoptères saproxyliques (Indice Patrimonial Bouget et al. 2019 : IP = 1 ou IP =2)</w:t>
+        <w:t xml:space="preserve">Effectif cumulé par piège sur l’ensemble des relevés saisonniers des individus d’espèces communes de coléoptères </w:t>
+      </w:r>
+      <w:proofErr w:type="spellStart"/>
+      <w:r>
+        <w:rPr>
+          <w:sz w:val="20"/>
+          <w:szCs w:val="20"/>
+        </w:rPr>
+        <w:t>saproxyliques</w:t>
+      </w:r>
+      <w:proofErr w:type="spellEnd"/>
+      <w:r>
+        <w:rPr>
+          <w:sz w:val="20"/>
+          <w:szCs w:val="20"/>
+        </w:rPr>
+        <w:t xml:space="preserve"> (Indice Patrimonial Bouget et al. 2019 : IP = 1 ou IP =2)</w:t>
       </w:r>
     </w:p>
     <w:p>
@@ -1772,13 +2095,24 @@
           <w:szCs w:val="20"/>
         </w:rPr>
       </w:pPr>
+      <w:proofErr w:type="spellStart"/>
+      <w:proofErr w:type="gramStart"/>
       <w:r>
         <w:rPr>
           <w:sz w:val="20"/>
           <w:szCs w:val="20"/>
         </w:rPr>
         <w:lastRenderedPageBreak/>
-        <w:t xml:space="preserve">rs.colsxcom Nombre cumulé par piège sur l’ensemble des relevés saisonniers des espèces </w:t>
+        <w:t>rs.colsxcom</w:t>
+      </w:r>
+      <w:proofErr w:type="spellEnd"/>
+      <w:proofErr w:type="gramEnd"/>
+      <w:r>
+        <w:rPr>
+          <w:sz w:val="20"/>
+          <w:szCs w:val="20"/>
+        </w:rPr>
+        <w:t xml:space="preserve"> Nombre cumulé par piège sur l’ensemble des relevés saisonniers des espèces </w:t>
       </w:r>
       <w:r>
         <w:rPr>
@@ -1792,7 +2126,23 @@
           <w:sz w:val="20"/>
           <w:szCs w:val="20"/>
         </w:rPr>
-        <w:t xml:space="preserve"> de coléoptères saproxyliques (Indice Patrimonial Bouget et al. 2019 : </w:t>
+        <w:t xml:space="preserve"> de coléoptères </w:t>
+      </w:r>
+      <w:proofErr w:type="spellStart"/>
+      <w:r>
+        <w:rPr>
+          <w:sz w:val="20"/>
+          <w:szCs w:val="20"/>
+        </w:rPr>
+        <w:t>saproxyliques</w:t>
+      </w:r>
+      <w:proofErr w:type="spellEnd"/>
+      <w:r>
+        <w:rPr>
+          <w:sz w:val="20"/>
+          <w:szCs w:val="20"/>
+        </w:rPr>
+        <w:t xml:space="preserve"> (Indice Patrimonial Bouget et al. 2019 : </w:t>
       </w:r>
       <w:r>
         <w:rPr>
@@ -1858,6 +2208,7 @@
           <w:szCs w:val="20"/>
         </w:rPr>
       </w:pPr>
+      <w:proofErr w:type="spellStart"/>
       <w:r>
         <w:rPr>
           <w:sz w:val="20"/>
@@ -1865,22 +2216,33 @@
         </w:rPr>
         <w:t>ab.myc</w:t>
       </w:r>
+      <w:proofErr w:type="spellEnd"/>
       <w:r>
         <w:rPr>
           <w:sz w:val="20"/>
           <w:szCs w:val="20"/>
         </w:rPr>
         <w:tab/>
-        <w:t>Effectif cumulé par piège sur l’ensemble des relevés saisonniers des individus de la guilde trophique larvaire des espèces mycétophages</w:t>
-      </w:r>
-    </w:p>
-    <w:p>
-      <w:pPr>
-        <w:rPr>
-          <w:sz w:val="20"/>
-          <w:szCs w:val="20"/>
-        </w:rPr>
-      </w:pPr>
+        <w:t xml:space="preserve">Effectif cumulé par piège sur l’ensemble des relevés saisonniers des individus de la guilde trophique larvaire des espèces </w:t>
+      </w:r>
+      <w:proofErr w:type="spellStart"/>
+      <w:r>
+        <w:rPr>
+          <w:sz w:val="20"/>
+          <w:szCs w:val="20"/>
+        </w:rPr>
+        <w:t>mycétophages</w:t>
+      </w:r>
+      <w:proofErr w:type="spellEnd"/>
+    </w:p>
+    <w:p>
+      <w:pPr>
+        <w:rPr>
+          <w:sz w:val="20"/>
+          <w:szCs w:val="20"/>
+        </w:rPr>
+      </w:pPr>
+      <w:proofErr w:type="spellStart"/>
       <w:r>
         <w:rPr>
           <w:sz w:val="20"/>
@@ -1888,22 +2250,33 @@
         </w:rPr>
         <w:t>rs.myc</w:t>
       </w:r>
+      <w:proofErr w:type="spellEnd"/>
       <w:r>
         <w:rPr>
           <w:sz w:val="20"/>
           <w:szCs w:val="20"/>
         </w:rPr>
         <w:tab/>
-        <w:t>Nombre cumulé par piège sur l’ensemble des relevés saisonniers des espèces de la guilde trophique larvaire mycétophage</w:t>
-      </w:r>
-    </w:p>
-    <w:p>
-      <w:pPr>
-        <w:rPr>
-          <w:sz w:val="20"/>
-          <w:szCs w:val="20"/>
-        </w:rPr>
-      </w:pPr>
+        <w:t xml:space="preserve">Nombre cumulé par piège sur l’ensemble des relevés saisonniers des espèces de la guilde trophique larvaire </w:t>
+      </w:r>
+      <w:proofErr w:type="spellStart"/>
+      <w:r>
+        <w:rPr>
+          <w:sz w:val="20"/>
+          <w:szCs w:val="20"/>
+        </w:rPr>
+        <w:t>mycétophage</w:t>
+      </w:r>
+      <w:proofErr w:type="spellEnd"/>
+    </w:p>
+    <w:p>
+      <w:pPr>
+        <w:rPr>
+          <w:sz w:val="20"/>
+          <w:szCs w:val="20"/>
+        </w:rPr>
+      </w:pPr>
+      <w:proofErr w:type="spellStart"/>
       <w:r>
         <w:rPr>
           <w:sz w:val="20"/>
@@ -1911,6 +2284,7 @@
         </w:rPr>
         <w:t>ab.xyl</w:t>
       </w:r>
+      <w:proofErr w:type="spellEnd"/>
       <w:r>
         <w:rPr>
           <w:sz w:val="20"/>
@@ -1927,6 +2301,7 @@
           <w:szCs w:val="20"/>
         </w:rPr>
       </w:pPr>
+      <w:proofErr w:type="spellStart"/>
       <w:r>
         <w:rPr>
           <w:sz w:val="20"/>
@@ -1934,6 +2309,7 @@
         </w:rPr>
         <w:t>rs.xyl</w:t>
       </w:r>
+      <w:proofErr w:type="spellEnd"/>
       <w:r>
         <w:rPr>
           <w:sz w:val="20"/>
@@ -1950,6 +2326,7 @@
           <w:szCs w:val="20"/>
         </w:rPr>
       </w:pPr>
+      <w:proofErr w:type="spellStart"/>
       <w:r>
         <w:rPr>
           <w:sz w:val="20"/>
@@ -1957,22 +2334,33 @@
         </w:rPr>
         <w:t>ab.sxy</w:t>
       </w:r>
+      <w:proofErr w:type="spellEnd"/>
       <w:r>
         <w:rPr>
           <w:sz w:val="20"/>
           <w:szCs w:val="20"/>
         </w:rPr>
         <w:tab/>
-        <w:t>Effectif cumulé par piège sur l’ensemble des relevés saisonniers des individus de la guilde trophique larvaire des espèces saproxylophages</w:t>
-      </w:r>
-    </w:p>
-    <w:p>
-      <w:pPr>
-        <w:rPr>
-          <w:sz w:val="20"/>
-          <w:szCs w:val="20"/>
-        </w:rPr>
-      </w:pPr>
+        <w:t xml:space="preserve">Effectif cumulé par piège sur l’ensemble des relevés saisonniers des individus de la guilde trophique larvaire des espèces </w:t>
+      </w:r>
+      <w:proofErr w:type="spellStart"/>
+      <w:r>
+        <w:rPr>
+          <w:sz w:val="20"/>
+          <w:szCs w:val="20"/>
+        </w:rPr>
+        <w:t>saproxylophages</w:t>
+      </w:r>
+      <w:proofErr w:type="spellEnd"/>
+    </w:p>
+    <w:p>
+      <w:pPr>
+        <w:rPr>
+          <w:sz w:val="20"/>
+          <w:szCs w:val="20"/>
+        </w:rPr>
+      </w:pPr>
+      <w:proofErr w:type="spellStart"/>
       <w:r>
         <w:rPr>
           <w:sz w:val="20"/>
@@ -1980,22 +2368,33 @@
         </w:rPr>
         <w:t>rs.sxy</w:t>
       </w:r>
+      <w:proofErr w:type="spellEnd"/>
       <w:r>
         <w:rPr>
           <w:sz w:val="20"/>
           <w:szCs w:val="20"/>
         </w:rPr>
         <w:tab/>
-        <w:t>Nombre cumulé par piège sur l’ensemble des relevés saisonniers des espèces de la guilde trophique larvaire saproxylophage</w:t>
-      </w:r>
-    </w:p>
-    <w:p>
-      <w:pPr>
-        <w:rPr>
-          <w:sz w:val="20"/>
-          <w:szCs w:val="20"/>
-        </w:rPr>
-      </w:pPr>
+        <w:t xml:space="preserve">Nombre cumulé par piège sur l’ensemble des relevés saisonniers des espèces de la guilde trophique larvaire </w:t>
+      </w:r>
+      <w:proofErr w:type="spellStart"/>
+      <w:r>
+        <w:rPr>
+          <w:sz w:val="20"/>
+          <w:szCs w:val="20"/>
+        </w:rPr>
+        <w:t>saproxylophage</w:t>
+      </w:r>
+      <w:proofErr w:type="spellEnd"/>
+    </w:p>
+    <w:p>
+      <w:pPr>
+        <w:rPr>
+          <w:sz w:val="20"/>
+          <w:szCs w:val="20"/>
+        </w:rPr>
+      </w:pPr>
+      <w:proofErr w:type="spellStart"/>
       <w:r>
         <w:rPr>
           <w:sz w:val="20"/>
@@ -2003,6 +2402,7 @@
         </w:rPr>
         <w:t>ab.zoo</w:t>
       </w:r>
+      <w:proofErr w:type="spellEnd"/>
       <w:r>
         <w:rPr>
           <w:sz w:val="20"/>
@@ -2019,12 +2419,21 @@
           <w:szCs w:val="20"/>
         </w:rPr>
       </w:pPr>
-      <w:r>
-        <w:rPr>
-          <w:sz w:val="20"/>
-          <w:szCs w:val="20"/>
-        </w:rPr>
-        <w:t>rs.zoo Nombre cumulé par piège sur l’ensemble des relevés saisonniers des espèces de la guilde trophique larvaire zoophage</w:t>
+      <w:proofErr w:type="spellStart"/>
+      <w:r>
+        <w:rPr>
+          <w:sz w:val="20"/>
+          <w:szCs w:val="20"/>
+        </w:rPr>
+        <w:t>rs.zoo</w:t>
+      </w:r>
+      <w:proofErr w:type="spellEnd"/>
+      <w:r>
+        <w:rPr>
+          <w:sz w:val="20"/>
+          <w:szCs w:val="20"/>
+        </w:rPr>
+        <w:t xml:space="preserve"> Nombre cumulé par piège sur l’ensemble des relevés saisonniers des espèces de la guilde trophique larvaire zoophage</w:t>
       </w:r>
     </w:p>
     <w:p>
@@ -2059,6 +2468,7 @@
           <w:szCs w:val="20"/>
         </w:rPr>
       </w:pPr>
+      <w:proofErr w:type="spellStart"/>
       <w:r>
         <w:rPr>
           <w:sz w:val="20"/>
@@ -2066,6 +2476,7 @@
         </w:rPr>
         <w:t>ab.flo</w:t>
       </w:r>
+      <w:proofErr w:type="spellEnd"/>
       <w:r>
         <w:rPr>
           <w:sz w:val="20"/>
@@ -2082,6 +2493,7 @@
           <w:szCs w:val="20"/>
         </w:rPr>
       </w:pPr>
+      <w:proofErr w:type="spellStart"/>
       <w:r>
         <w:rPr>
           <w:sz w:val="20"/>
@@ -2089,6 +2501,7 @@
         </w:rPr>
         <w:t>sr.flo</w:t>
       </w:r>
+      <w:proofErr w:type="spellEnd"/>
       <w:r>
         <w:rPr>
           <w:sz w:val="20"/>
@@ -2120,16 +2533,35 @@
           <w:sz w:val="20"/>
           <w:szCs w:val="20"/>
         </w:rPr>
-        <w:t>Guildes de microhabitat larvaire</w:t>
-      </w:r>
-    </w:p>
-    <w:p>
-      <w:pPr>
-        <w:rPr>
-          <w:sz w:val="20"/>
-          <w:szCs w:val="20"/>
-        </w:rPr>
-      </w:pPr>
+        <w:t xml:space="preserve">Guildes de </w:t>
+      </w:r>
+      <w:proofErr w:type="spellStart"/>
+      <w:r>
+        <w:rPr>
+          <w:color w:val="FF0000"/>
+          <w:sz w:val="20"/>
+          <w:szCs w:val="20"/>
+        </w:rPr>
+        <w:t>microhabitat</w:t>
+      </w:r>
+      <w:proofErr w:type="spellEnd"/>
+      <w:r>
+        <w:rPr>
+          <w:color w:val="FF0000"/>
+          <w:sz w:val="20"/>
+          <w:szCs w:val="20"/>
+        </w:rPr>
+        <w:t xml:space="preserve"> larvaire</w:t>
+      </w:r>
+    </w:p>
+    <w:p>
+      <w:pPr>
+        <w:rPr>
+          <w:sz w:val="20"/>
+          <w:szCs w:val="20"/>
+        </w:rPr>
+      </w:pPr>
+      <w:proofErr w:type="spellStart"/>
       <w:r>
         <w:rPr>
           <w:sz w:val="20"/>
@@ -2137,22 +2569,40 @@
         </w:rPr>
         <w:t>ab.pho</w:t>
       </w:r>
+      <w:proofErr w:type="spellEnd"/>
       <w:r>
         <w:rPr>
           <w:sz w:val="20"/>
           <w:szCs w:val="20"/>
         </w:rPr>
         <w:tab/>
-        <w:t xml:space="preserve">Effectif cumulé par placette et par relevé des individus de la guilde larvaire des espèces pholeophiles facultatives et obligatoires (abritées dans un nid de vertébrés) </w:t>
-      </w:r>
-    </w:p>
-    <w:p>
-      <w:pPr>
-        <w:rPr>
-          <w:sz w:val="20"/>
-          <w:szCs w:val="20"/>
-        </w:rPr>
-      </w:pPr>
+        <w:t xml:space="preserve">Effectif cumulé par placette et par relevé des individus de la guilde larvaire des espèces </w:t>
+      </w:r>
+      <w:proofErr w:type="spellStart"/>
+      <w:r>
+        <w:rPr>
+          <w:sz w:val="20"/>
+          <w:szCs w:val="20"/>
+        </w:rPr>
+        <w:t>pholeophiles</w:t>
+      </w:r>
+      <w:proofErr w:type="spellEnd"/>
+      <w:r>
+        <w:rPr>
+          <w:sz w:val="20"/>
+          <w:szCs w:val="20"/>
+        </w:rPr>
+        <w:t xml:space="preserve"> facultatives et obligatoires (abritées dans un nid de vertébrés) </w:t>
+      </w:r>
+    </w:p>
+    <w:p>
+      <w:pPr>
+        <w:rPr>
+          <w:sz w:val="20"/>
+          <w:szCs w:val="20"/>
+        </w:rPr>
+      </w:pPr>
+      <w:proofErr w:type="spellStart"/>
       <w:r>
         <w:rPr>
           <w:sz w:val="20"/>
@@ -2160,22 +2610,41 @@
         </w:rPr>
         <w:t>rs.pho</w:t>
       </w:r>
+      <w:proofErr w:type="spellEnd"/>
       <w:r>
         <w:rPr>
           <w:sz w:val="20"/>
           <w:szCs w:val="20"/>
         </w:rPr>
         <w:tab/>
-        <w:t>Nombre cumulé par placette et par relevé des espèces de la guilde larvaire des espèces pholeophiles facultatives et obligatoires (abritées dans un nid de vertébrés)</w:t>
-      </w:r>
-    </w:p>
-    <w:p>
-      <w:pPr>
-        <w:rPr>
-          <w:sz w:val="20"/>
-          <w:szCs w:val="20"/>
-        </w:rPr>
-      </w:pPr>
+        <w:t xml:space="preserve">Nombre cumulé par placette et par relevé des espèces de la guilde larvaire des espèces </w:t>
+      </w:r>
+      <w:proofErr w:type="spellStart"/>
+      <w:r>
+        <w:rPr>
+          <w:sz w:val="20"/>
+          <w:szCs w:val="20"/>
+        </w:rPr>
+        <w:t>pholeophiles</w:t>
+      </w:r>
+      <w:proofErr w:type="spellEnd"/>
+      <w:r>
+        <w:rPr>
+          <w:sz w:val="20"/>
+          <w:szCs w:val="20"/>
+        </w:rPr>
+        <w:t xml:space="preserve"> facultatives et obligatoires (abritées dans un nid de vertébrés)</w:t>
+      </w:r>
+    </w:p>
+    <w:p>
+      <w:pPr>
+        <w:rPr>
+          <w:sz w:val="20"/>
+          <w:szCs w:val="20"/>
+        </w:rPr>
+      </w:pPr>
+      <w:proofErr w:type="spellStart"/>
+      <w:proofErr w:type="gramStart"/>
       <w:r>
         <w:rPr>
           <w:sz w:val="20"/>
@@ -2190,13 +2659,31 @@
         </w:rPr>
         <w:t>spe</w:t>
       </w:r>
+      <w:proofErr w:type="spellEnd"/>
+      <w:proofErr w:type="gramEnd"/>
       <w:r>
         <w:rPr>
           <w:sz w:val="20"/>
           <w:szCs w:val="20"/>
         </w:rPr>
         <w:tab/>
-        <w:t xml:space="preserve">Effectif cumulé par placette et par relevé des individus de la guilde larvaire des espèces cavicoles </w:t>
+        <w:t xml:space="preserve">Effectif cumulé par placette et par relevé des individus de la guilde larvaire des espèces </w:t>
+      </w:r>
+      <w:proofErr w:type="spellStart"/>
+      <w:r>
+        <w:rPr>
+          <w:sz w:val="20"/>
+          <w:szCs w:val="20"/>
+        </w:rPr>
+        <w:t>cavicoles</w:t>
+      </w:r>
+      <w:proofErr w:type="spellEnd"/>
+      <w:r>
+        <w:rPr>
+          <w:sz w:val="20"/>
+          <w:szCs w:val="20"/>
+        </w:rPr>
+        <w:t xml:space="preserve"> </w:t>
       </w:r>
       <w:r>
         <w:rPr>
@@ -2217,7 +2704,23 @@
           <w:sz w:val="20"/>
           <w:szCs w:val="20"/>
         </w:rPr>
-        <w:t>ne vivent pas dans un autre microhabitat qu’</w:t>
+        <w:t xml:space="preserve">ne vivent pas dans un autre </w:t>
+      </w:r>
+      <w:proofErr w:type="spellStart"/>
+      <w:r>
+        <w:rPr>
+          <w:sz w:val="20"/>
+          <w:szCs w:val="20"/>
+        </w:rPr>
+        <w:t>microhabitat</w:t>
+      </w:r>
+      <w:proofErr w:type="spellEnd"/>
+      <w:r>
+        <w:rPr>
+          <w:sz w:val="20"/>
+          <w:szCs w:val="20"/>
+        </w:rPr>
+        <w:t xml:space="preserve"> qu’</w:t>
       </w:r>
       <w:r>
         <w:rPr>
@@ -2234,6 +2737,8 @@
           <w:szCs w:val="20"/>
         </w:rPr>
       </w:pPr>
+      <w:proofErr w:type="spellStart"/>
+      <w:proofErr w:type="gramStart"/>
       <w:r>
         <w:rPr>
           <w:sz w:val="20"/>
@@ -2248,29 +2753,64 @@
         </w:rPr>
         <w:t>spe</w:t>
       </w:r>
+      <w:proofErr w:type="spellEnd"/>
+      <w:proofErr w:type="gramEnd"/>
       <w:r>
         <w:rPr>
           <w:sz w:val="20"/>
           <w:szCs w:val="20"/>
         </w:rPr>
         <w:tab/>
-        <w:t xml:space="preserve">Nombre cumulé par placette et par relevé des espèces de la guilde larvaire des espèces cavicoles </w:t>
-      </w:r>
-      <w:r>
-        <w:rPr>
-          <w:sz w:val="20"/>
-          <w:szCs w:val="20"/>
-        </w:rPr>
-        <w:t>spécialistes (ne vivent pas dans un autre microhabitat qu’une cavité)</w:t>
-      </w:r>
-    </w:p>
-    <w:p>
-      <w:pPr>
-        <w:rPr>
-          <w:sz w:val="20"/>
-          <w:szCs w:val="20"/>
-        </w:rPr>
-      </w:pPr>
+        <w:t xml:space="preserve">Nombre cumulé par placette et par relevé des espèces de la guilde larvaire des espèces </w:t>
+      </w:r>
+      <w:proofErr w:type="spellStart"/>
+      <w:r>
+        <w:rPr>
+          <w:sz w:val="20"/>
+          <w:szCs w:val="20"/>
+        </w:rPr>
+        <w:t>cavicoles</w:t>
+      </w:r>
+      <w:proofErr w:type="spellEnd"/>
+      <w:r>
+        <w:rPr>
+          <w:sz w:val="20"/>
+          <w:szCs w:val="20"/>
+        </w:rPr>
+        <w:t xml:space="preserve"> </w:t>
+      </w:r>
+      <w:r>
+        <w:rPr>
+          <w:sz w:val="20"/>
+          <w:szCs w:val="20"/>
+        </w:rPr>
+        <w:t xml:space="preserve">spécialistes (ne vivent pas dans un autre </w:t>
+      </w:r>
+      <w:proofErr w:type="spellStart"/>
+      <w:r>
+        <w:rPr>
+          <w:sz w:val="20"/>
+          <w:szCs w:val="20"/>
+        </w:rPr>
+        <w:t>microhabitat</w:t>
+      </w:r>
+      <w:proofErr w:type="spellEnd"/>
+      <w:r>
+        <w:rPr>
+          <w:sz w:val="20"/>
+          <w:szCs w:val="20"/>
+        </w:rPr>
+        <w:t xml:space="preserve"> qu’une cavité)</w:t>
+      </w:r>
+    </w:p>
+    <w:p>
+      <w:pPr>
+        <w:rPr>
+          <w:sz w:val="20"/>
+          <w:szCs w:val="20"/>
+        </w:rPr>
+      </w:pPr>
+      <w:proofErr w:type="spellStart"/>
       <w:r>
         <w:rPr>
           <w:sz w:val="20"/>
@@ -2278,22 +2818,40 @@
         </w:rPr>
         <w:t>ab.cav</w:t>
       </w:r>
+      <w:proofErr w:type="spellEnd"/>
       <w:r>
         <w:rPr>
           <w:sz w:val="20"/>
           <w:szCs w:val="20"/>
         </w:rPr>
         <w:tab/>
-        <w:t>Effectif cumulé par placette et par relevé des individus de la guilde larvaire des espèces cavicoles facultatives et obligatoires (abritées dans une cavité)</w:t>
-      </w:r>
-    </w:p>
-    <w:p>
-      <w:pPr>
-        <w:rPr>
-          <w:sz w:val="20"/>
-          <w:szCs w:val="20"/>
-        </w:rPr>
-      </w:pPr>
+        <w:t xml:space="preserve">Effectif cumulé par placette et par relevé des individus de la guilde larvaire des espèces </w:t>
+      </w:r>
+      <w:proofErr w:type="spellStart"/>
+      <w:r>
+        <w:rPr>
+          <w:sz w:val="20"/>
+          <w:szCs w:val="20"/>
+        </w:rPr>
+        <w:t>cavicoles</w:t>
+      </w:r>
+      <w:proofErr w:type="spellEnd"/>
+      <w:r>
+        <w:rPr>
+          <w:sz w:val="20"/>
+          <w:szCs w:val="20"/>
+        </w:rPr>
+        <w:t xml:space="preserve"> facultatives et obligatoires (abritées dans une cavité)</w:t>
+      </w:r>
+    </w:p>
+    <w:p>
+      <w:pPr>
+        <w:rPr>
+          <w:sz w:val="20"/>
+          <w:szCs w:val="20"/>
+        </w:rPr>
+      </w:pPr>
+      <w:proofErr w:type="spellStart"/>
       <w:r>
         <w:rPr>
           <w:sz w:val="20"/>
@@ -2301,13 +2859,30 @@
         </w:rPr>
         <w:t>sr.cav</w:t>
       </w:r>
+      <w:proofErr w:type="spellEnd"/>
       <w:r>
         <w:rPr>
           <w:sz w:val="20"/>
           <w:szCs w:val="20"/>
         </w:rPr>
         <w:tab/>
-        <w:t>Nombre cumulé par placette et par relevé des espèces de la guilde larvaire des espèces cavicoles facultatives et obligatoires (abritées dans une cavité)</w:t>
+        <w:t xml:space="preserve">Nombre cumulé par placette et par relevé des espèces de la guilde larvaire des espèces </w:t>
+      </w:r>
+      <w:proofErr w:type="spellStart"/>
+      <w:r>
+        <w:rPr>
+          <w:sz w:val="20"/>
+          <w:szCs w:val="20"/>
+        </w:rPr>
+        <w:t>cavicoles</w:t>
+      </w:r>
+      <w:proofErr w:type="spellEnd"/>
+      <w:r>
+        <w:rPr>
+          <w:sz w:val="20"/>
+          <w:szCs w:val="20"/>
+        </w:rPr>
+        <w:t xml:space="preserve"> facultatives et obligatoires (abritées dans une cavité)</w:t>
       </w:r>
     </w:p>
     <w:p>
@@ -2330,7 +2905,39 @@
           <w:szCs w:val="20"/>
         </w:rPr>
         <w:tab/>
-        <w:t>Effectif cumulé par placette et par relevé des individus de la guilde larvaire des espèces fongicoles facultatives et obligatoires (dans un sporophore, ou sur des hyphes subcorticoles)</w:t>
+        <w:t xml:space="preserve">Effectif cumulé par placette et par relevé des individus de la guilde larvaire des espèces fongicoles facultatives et obligatoires (dans un </w:t>
+      </w:r>
+      <w:proofErr w:type="spellStart"/>
+      <w:r>
+        <w:rPr>
+          <w:sz w:val="20"/>
+          <w:szCs w:val="20"/>
+        </w:rPr>
+        <w:t>sporophore</w:t>
+      </w:r>
+      <w:proofErr w:type="spellEnd"/>
+      <w:r>
+        <w:rPr>
+          <w:sz w:val="20"/>
+          <w:szCs w:val="20"/>
+        </w:rPr>
+        <w:t xml:space="preserve">, ou sur des hyphes </w:t>
+      </w:r>
+      <w:proofErr w:type="spellStart"/>
+      <w:r>
+        <w:rPr>
+          <w:sz w:val="20"/>
+          <w:szCs w:val="20"/>
+        </w:rPr>
+        <w:t>subcorticoles</w:t>
+      </w:r>
+      <w:proofErr w:type="spellEnd"/>
+      <w:r>
+        <w:rPr>
+          <w:sz w:val="20"/>
+          <w:szCs w:val="20"/>
+        </w:rPr>
+        <w:t>)</w:t>
       </w:r>
     </w:p>
     <w:p>
@@ -2353,16 +2960,50 @@
           <w:szCs w:val="20"/>
         </w:rPr>
         <w:tab/>
-        <w:t>Nombre cumulé par placette et par relevé des espèces de la guilde larvaire des espèces fongicoles facultatives et obligatoires (dans un sporophore, ou sur des hyphes subcorticoles)</w:t>
-      </w:r>
-    </w:p>
-    <w:p>
-      <w:pPr>
-        <w:rPr>
-          <w:sz w:val="20"/>
-          <w:szCs w:val="20"/>
-        </w:rPr>
-      </w:pPr>
+        <w:t xml:space="preserve">Nombre cumulé par placette et par relevé des espèces de la guilde larvaire des espèces fongicoles facultatives et obligatoires (dans un </w:t>
+      </w:r>
+      <w:proofErr w:type="spellStart"/>
+      <w:r>
+        <w:rPr>
+          <w:sz w:val="20"/>
+          <w:szCs w:val="20"/>
+        </w:rPr>
+        <w:t>sporophore</w:t>
+      </w:r>
+      <w:proofErr w:type="spellEnd"/>
+      <w:r>
+        <w:rPr>
+          <w:sz w:val="20"/>
+          <w:szCs w:val="20"/>
+        </w:rPr>
+        <w:t xml:space="preserve">, ou sur des hyphes </w:t>
+      </w:r>
+      <w:proofErr w:type="spellStart"/>
+      <w:r>
+        <w:rPr>
+          <w:sz w:val="20"/>
+          <w:szCs w:val="20"/>
+        </w:rPr>
+        <w:t>subcorticoles</w:t>
+      </w:r>
+      <w:proofErr w:type="spellEnd"/>
+      <w:r>
+        <w:rPr>
+          <w:sz w:val="20"/>
+          <w:szCs w:val="20"/>
+        </w:rPr>
+        <w:t>)</w:t>
+      </w:r>
+    </w:p>
+    <w:p>
+      <w:pPr>
+        <w:rPr>
+          <w:sz w:val="20"/>
+          <w:szCs w:val="20"/>
+        </w:rPr>
+      </w:pPr>
+      <w:proofErr w:type="spellStart"/>
+      <w:proofErr w:type="gramStart"/>
       <w:r>
         <w:rPr>
           <w:sz w:val="20"/>
@@ -2371,22 +3012,58 @@
         <w:lastRenderedPageBreak/>
         <w:t>ab.fonspe</w:t>
       </w:r>
+      <w:proofErr w:type="spellEnd"/>
+      <w:proofErr w:type="gramEnd"/>
       <w:r>
         <w:rPr>
           <w:sz w:val="20"/>
           <w:szCs w:val="20"/>
         </w:rPr>
         <w:tab/>
-        <w:t>Effectif cumulé par placette et par relevé des individus de la guilde larvaire des espèces fongicoles spécialistes (ne vivent pas dans un autre microhabitat qu’un sporophore ou un bois rempli d’hyphes)</w:t>
-      </w:r>
-    </w:p>
-    <w:p>
-      <w:pPr>
-        <w:rPr>
-          <w:sz w:val="20"/>
-          <w:szCs w:val="20"/>
-        </w:rPr>
-      </w:pPr>
+        <w:t xml:space="preserve">Effectif cumulé par placette et par relevé des individus de la guilde larvaire des espèces fongicoles spécialistes (ne vivent pas dans un autre </w:t>
+      </w:r>
+      <w:proofErr w:type="spellStart"/>
+      <w:r>
+        <w:rPr>
+          <w:sz w:val="20"/>
+          <w:szCs w:val="20"/>
+        </w:rPr>
+        <w:t>microhabitat</w:t>
+      </w:r>
+      <w:proofErr w:type="spellEnd"/>
+      <w:r>
+        <w:rPr>
+          <w:sz w:val="20"/>
+          <w:szCs w:val="20"/>
+        </w:rPr>
+        <w:t xml:space="preserve"> qu’un </w:t>
+      </w:r>
+      <w:proofErr w:type="spellStart"/>
+      <w:r>
+        <w:rPr>
+          <w:sz w:val="20"/>
+          <w:szCs w:val="20"/>
+        </w:rPr>
+        <w:t>sporophore</w:t>
+      </w:r>
+      <w:proofErr w:type="spellEnd"/>
+      <w:r>
+        <w:rPr>
+          <w:sz w:val="20"/>
+          <w:szCs w:val="20"/>
+        </w:rPr>
+        <w:t xml:space="preserve"> ou un bois rempli d’hyphes)</w:t>
+      </w:r>
+    </w:p>
+    <w:p>
+      <w:pPr>
+        <w:rPr>
+          <w:sz w:val="20"/>
+          <w:szCs w:val="20"/>
+        </w:rPr>
+      </w:pPr>
+      <w:proofErr w:type="spellStart"/>
+      <w:proofErr w:type="gramStart"/>
       <w:r>
         <w:rPr>
           <w:sz w:val="20"/>
@@ -2394,22 +3071,57 @@
         </w:rPr>
         <w:t>sr.fonspe</w:t>
       </w:r>
+      <w:proofErr w:type="spellEnd"/>
+      <w:proofErr w:type="gramEnd"/>
       <w:r>
         <w:rPr>
           <w:sz w:val="20"/>
           <w:szCs w:val="20"/>
         </w:rPr>
         <w:tab/>
-        <w:t>Nombre cumulé par placette et par relevé des espèces de la guilde larvaire des espèces fongicoles spécialistes (ne vivent pas dans un autre microhabitat qu’un sporophore ou un bois rempli d’hyphes)</w:t>
-      </w:r>
-    </w:p>
-    <w:p>
-      <w:pPr>
-        <w:rPr>
-          <w:sz w:val="20"/>
-          <w:szCs w:val="20"/>
-        </w:rPr>
-      </w:pPr>
+        <w:t xml:space="preserve">Nombre cumulé par placette et par relevé des espèces de la guilde larvaire des espèces fongicoles spécialistes (ne vivent pas dans un autre </w:t>
+      </w:r>
+      <w:proofErr w:type="spellStart"/>
+      <w:r>
+        <w:rPr>
+          <w:sz w:val="20"/>
+          <w:szCs w:val="20"/>
+        </w:rPr>
+        <w:t>microhabitat</w:t>
+      </w:r>
+      <w:proofErr w:type="spellEnd"/>
+      <w:r>
+        <w:rPr>
+          <w:sz w:val="20"/>
+          <w:szCs w:val="20"/>
+        </w:rPr>
+        <w:t xml:space="preserve"> qu’un </w:t>
+      </w:r>
+      <w:proofErr w:type="spellStart"/>
+      <w:r>
+        <w:rPr>
+          <w:sz w:val="20"/>
+          <w:szCs w:val="20"/>
+        </w:rPr>
+        <w:t>sporophore</w:t>
+      </w:r>
+      <w:proofErr w:type="spellEnd"/>
+      <w:r>
+        <w:rPr>
+          <w:sz w:val="20"/>
+          <w:szCs w:val="20"/>
+        </w:rPr>
+        <w:t xml:space="preserve"> ou un bois rempli d’hyphes)</w:t>
+      </w:r>
+    </w:p>
+    <w:p>
+      <w:pPr>
+        <w:rPr>
+          <w:sz w:val="20"/>
+          <w:szCs w:val="20"/>
+        </w:rPr>
+      </w:pPr>
+      <w:proofErr w:type="spellStart"/>
       <w:r>
         <w:rPr>
           <w:sz w:val="20"/>
@@ -2417,6 +3129,7 @@
         </w:rPr>
         <w:t>ab.suc</w:t>
       </w:r>
+      <w:proofErr w:type="spellEnd"/>
       <w:r>
         <w:rPr>
           <w:sz w:val="20"/>
@@ -2425,6 +3138,7 @@
         <w:tab/>
         <w:t xml:space="preserve">Effectif cumulé par placette et par relevé des individus de la guilde larvaire des espèces </w:t>
       </w:r>
+      <w:proofErr w:type="spellStart"/>
       <w:r>
         <w:rPr>
           <w:sz w:val="20"/>
@@ -2432,6 +3146,7 @@
         </w:rPr>
         <w:t>succicoles</w:t>
       </w:r>
+      <w:proofErr w:type="spellEnd"/>
       <w:r>
         <w:rPr>
           <w:sz w:val="20"/>
@@ -2461,6 +3176,7 @@
           <w:szCs w:val="20"/>
         </w:rPr>
       </w:pPr>
+      <w:proofErr w:type="spellStart"/>
       <w:r>
         <w:rPr>
           <w:sz w:val="20"/>
@@ -2468,6 +3184,7 @@
         </w:rPr>
         <w:t>sr.suc</w:t>
       </w:r>
+      <w:proofErr w:type="spellEnd"/>
       <w:r>
         <w:rPr>
           <w:sz w:val="20"/>
@@ -2476,21 +3193,31 @@
         <w:tab/>
         <w:t xml:space="preserve">Nombre cumulé par placette et par relevé des espèces de la guilde larvaire des espèces </w:t>
       </w:r>
-      <w:r>
-        <w:rPr>
-          <w:sz w:val="20"/>
-          <w:szCs w:val="20"/>
-        </w:rPr>
-        <w:t>succicoles facultatives et obligatoires (dans un écoulement de sève)</w:t>
-      </w:r>
-    </w:p>
-    <w:p>
-      <w:pPr>
-        <w:rPr>
-          <w:sz w:val="20"/>
-          <w:szCs w:val="20"/>
-        </w:rPr>
-      </w:pPr>
+      <w:proofErr w:type="spellStart"/>
+      <w:r>
+        <w:rPr>
+          <w:sz w:val="20"/>
+          <w:szCs w:val="20"/>
+        </w:rPr>
+        <w:t>succicoles</w:t>
+      </w:r>
+      <w:proofErr w:type="spellEnd"/>
+      <w:r>
+        <w:rPr>
+          <w:sz w:val="20"/>
+          <w:szCs w:val="20"/>
+        </w:rPr>
+        <w:t xml:space="preserve"> facultatives et obligatoires (dans un écoulement de sève)</w:t>
+      </w:r>
+    </w:p>
+    <w:p>
+      <w:pPr>
+        <w:rPr>
+          <w:sz w:val="20"/>
+          <w:szCs w:val="20"/>
+        </w:rPr>
+      </w:pPr>
+      <w:proofErr w:type="spellStart"/>
       <w:r>
         <w:rPr>
           <w:sz w:val="20"/>
@@ -2498,22 +3225,33 @@
         </w:rPr>
         <w:t>ab.lig</w:t>
       </w:r>
+      <w:proofErr w:type="spellEnd"/>
       <w:r>
         <w:rPr>
           <w:sz w:val="20"/>
           <w:szCs w:val="20"/>
         </w:rPr>
         <w:tab/>
-        <w:t>Effectif cumulé par placette et par relevé des individus de la guilde larvaire des espèces lignicoles facultatives et obligatoires (dans le bois mort)</w:t>
-      </w:r>
-    </w:p>
-    <w:p>
-      <w:pPr>
-        <w:rPr>
-          <w:sz w:val="20"/>
-          <w:szCs w:val="20"/>
-        </w:rPr>
-      </w:pPr>
+        <w:t>Effectif cumulé par placette et par relevé des individus de la guilde larvaire des espèces lignicoles facultatives et obligatoires (dans le bo</w:t>
+      </w:r>
+      <w:bookmarkStart w:id="0" w:name="_GoBack"/>
+      <w:bookmarkEnd w:id="0"/>
+      <w:r>
+        <w:rPr>
+          <w:sz w:val="20"/>
+          <w:szCs w:val="20"/>
+        </w:rPr>
+        <w:t>is mort)</w:t>
+      </w:r>
+    </w:p>
+    <w:p>
+      <w:pPr>
+        <w:rPr>
+          <w:sz w:val="20"/>
+          <w:szCs w:val="20"/>
+        </w:rPr>
+      </w:pPr>
+      <w:proofErr w:type="spellStart"/>
       <w:r>
         <w:rPr>
           <w:sz w:val="20"/>
@@ -2521,6 +3259,7 @@
         </w:rPr>
         <w:t>sr.lig</w:t>
       </w:r>
+      <w:proofErr w:type="spellEnd"/>
       <w:r>
         <w:rPr>
           <w:sz w:val="20"/>
@@ -2537,6 +3276,93 @@
           <w:szCs w:val="20"/>
         </w:rPr>
       </w:pPr>
+      <w:proofErr w:type="spellStart"/>
+      <w:proofErr w:type="gramStart"/>
+      <w:r>
+        <w:rPr>
+          <w:sz w:val="20"/>
+          <w:szCs w:val="20"/>
+        </w:rPr>
+        <w:t>ab.colsxrsx</w:t>
+      </w:r>
+      <w:proofErr w:type="spellEnd"/>
+      <w:proofErr w:type="gramEnd"/>
+      <w:r>
+        <w:rPr>
+          <w:sz w:val="20"/>
+          <w:szCs w:val="20"/>
+        </w:rPr>
+        <w:tab/>
+      </w:r>
+      <w:r>
+        <w:rPr>
+          <w:sz w:val="20"/>
+          <w:szCs w:val="20"/>
+        </w:rPr>
+        <w:t>Effectif cumulé par placette et par relevé des individus de la guilde larvaire des espèces</w:t>
+      </w:r>
+      <w:r>
+        <w:rPr>
+          <w:sz w:val="20"/>
+          <w:szCs w:val="20"/>
+        </w:rPr>
+        <w:t xml:space="preserve"> </w:t>
+      </w:r>
+      <w:r>
+        <w:rPr>
+          <w:sz w:val="20"/>
+          <w:szCs w:val="20"/>
+        </w:rPr>
+        <w:t>associées aux résineux (notamment Pinus et Abiétinées)</w:t>
+      </w:r>
+    </w:p>
+    <w:p>
+      <w:pPr>
+        <w:rPr>
+          <w:sz w:val="20"/>
+          <w:szCs w:val="20"/>
+        </w:rPr>
+      </w:pPr>
+      <w:proofErr w:type="spellStart"/>
+      <w:proofErr w:type="gramStart"/>
+      <w:r>
+        <w:rPr>
+          <w:sz w:val="20"/>
+          <w:szCs w:val="20"/>
+        </w:rPr>
+        <w:t>sr.colsxrsx</w:t>
+      </w:r>
+      <w:proofErr w:type="spellEnd"/>
+      <w:proofErr w:type="gramEnd"/>
+      <w:r>
+        <w:rPr>
+          <w:sz w:val="20"/>
+          <w:szCs w:val="20"/>
+        </w:rPr>
+        <w:tab/>
+      </w:r>
+      <w:r>
+        <w:rPr>
+          <w:sz w:val="20"/>
+          <w:szCs w:val="20"/>
+        </w:rPr>
+        <w:t>Nombre cumulé par placette et par relevé des espèces de la guilde larvaire des espèces</w:t>
+      </w:r>
+      <w:r>
+        <w:rPr>
+          <w:sz w:val="20"/>
+          <w:szCs w:val="20"/>
+        </w:rPr>
+        <w:t xml:space="preserve"> associées aux résineux (notamment Pinus et Abiétinées)</w:t>
+      </w:r>
+    </w:p>
+    <w:p>
+      <w:pPr>
+        <w:rPr>
+          <w:sz w:val="20"/>
+          <w:szCs w:val="20"/>
+        </w:rPr>
+      </w:pPr>
     </w:p>
     <w:p>
       <w:pPr>
@@ -2569,6 +3395,8 @@
           <w:szCs w:val="20"/>
         </w:rPr>
       </w:pPr>
+      <w:proofErr w:type="spellStart"/>
+      <w:proofErr w:type="gramStart"/>
       <w:r>
         <w:rPr>
           <w:sz w:val="20"/>
@@ -2583,22 +3411,42 @@
         </w:rPr>
         <w:t>canopy.niche</w:t>
       </w:r>
+      <w:proofErr w:type="spellEnd"/>
+      <w:proofErr w:type="gramEnd"/>
       <w:r>
         <w:rPr>
           <w:sz w:val="20"/>
           <w:szCs w:val="20"/>
         </w:rPr>
         <w:tab/>
-        <w:t>Trait moyen de préférence de canopée (= héliophilie moyenne) de l’assemblage d’espèces</w:t>
-      </w:r>
-    </w:p>
-    <w:p>
-      <w:pPr>
-        <w:rPr>
-          <w:sz w:val="20"/>
-          <w:szCs w:val="20"/>
-        </w:rPr>
-      </w:pPr>
+        <w:t xml:space="preserve">Trait moyen de préférence de canopée (= </w:t>
+      </w:r>
+      <w:proofErr w:type="spellStart"/>
+      <w:r>
+        <w:rPr>
+          <w:sz w:val="20"/>
+          <w:szCs w:val="20"/>
+        </w:rPr>
+        <w:t>héliophilie</w:t>
+      </w:r>
+      <w:proofErr w:type="spellEnd"/>
+      <w:r>
+        <w:rPr>
+          <w:sz w:val="20"/>
+          <w:szCs w:val="20"/>
+        </w:rPr>
+        <w:t xml:space="preserve"> moyenne) de l’assemblage d’espèces</w:t>
+      </w:r>
+    </w:p>
+    <w:p>
+      <w:pPr>
+        <w:rPr>
+          <w:sz w:val="20"/>
+          <w:szCs w:val="20"/>
+        </w:rPr>
+      </w:pPr>
+      <w:proofErr w:type="spellStart"/>
+      <w:proofErr w:type="gramStart"/>
       <w:r>
         <w:rPr>
           <w:sz w:val="20"/>
@@ -2613,6 +3461,8 @@
         </w:rPr>
         <w:t>canopy.niche</w:t>
       </w:r>
+      <w:proofErr w:type="spellEnd"/>
+      <w:proofErr w:type="gramEnd"/>
       <w:r>
         <w:rPr>
           <w:sz w:val="20"/>
@@ -2632,7 +3482,23 @@
           <w:sz w:val="20"/>
           <w:szCs w:val="20"/>
         </w:rPr>
-        <w:t>variance de trait de préférence de canopée (= héliophilie moyenne) de l’assemblage</w:t>
+        <w:t xml:space="preserve">variance de trait de préférence de canopée (= </w:t>
+      </w:r>
+      <w:proofErr w:type="spellStart"/>
+      <w:r>
+        <w:rPr>
+          <w:sz w:val="20"/>
+          <w:szCs w:val="20"/>
+        </w:rPr>
+        <w:t>héliophilie</w:t>
+      </w:r>
+      <w:proofErr w:type="spellEnd"/>
+      <w:r>
+        <w:rPr>
+          <w:sz w:val="20"/>
+          <w:szCs w:val="20"/>
+        </w:rPr>
+        <w:t xml:space="preserve"> moyenne) de l’assemblage</w:t>
       </w:r>
     </w:p>
     <w:p>
@@ -2729,6 +3595,8 @@
           <w:szCs w:val="20"/>
         </w:rPr>
       </w:pPr>
+      <w:proofErr w:type="spellStart"/>
+      <w:proofErr w:type="gramStart"/>
       <w:r>
         <w:rPr>
           <w:sz w:val="20"/>
@@ -2743,6 +3611,8 @@
         </w:rPr>
         <w:t>diameter.niche</w:t>
       </w:r>
+      <w:proofErr w:type="spellEnd"/>
+      <w:proofErr w:type="gramEnd"/>
       <w:r>
         <w:rPr>
           <w:sz w:val="20"/>
@@ -2769,16 +3639,27 @@
           <w:sz w:val="20"/>
           <w:szCs w:val="20"/>
         </w:rPr>
-        <w:t>de préférence de classe de diamètre du substrat saproxylique</w:t>
-      </w:r>
-    </w:p>
-    <w:p>
-      <w:pPr>
-        <w:rPr>
-          <w:sz w:val="20"/>
-          <w:szCs w:val="20"/>
-        </w:rPr>
-      </w:pPr>
+        <w:t xml:space="preserve">de préférence de classe de diamètre du substrat </w:t>
+      </w:r>
+      <w:proofErr w:type="spellStart"/>
+      <w:r>
+        <w:rPr>
+          <w:sz w:val="20"/>
+          <w:szCs w:val="20"/>
+        </w:rPr>
+        <w:t>saproxylique</w:t>
+      </w:r>
+      <w:proofErr w:type="spellEnd"/>
+    </w:p>
+    <w:p>
+      <w:pPr>
+        <w:rPr>
+          <w:sz w:val="20"/>
+          <w:szCs w:val="20"/>
+        </w:rPr>
+      </w:pPr>
+      <w:proofErr w:type="spellStart"/>
+      <w:proofErr w:type="gramStart"/>
       <w:r>
         <w:rPr>
           <w:sz w:val="20"/>
@@ -2793,6 +3674,8 @@
         </w:rPr>
         <w:t>diameter.niche</w:t>
       </w:r>
+      <w:proofErr w:type="spellEnd"/>
+      <w:proofErr w:type="gramEnd"/>
       <w:r>
         <w:rPr>
           <w:sz w:val="20"/>
@@ -2812,16 +3695,27 @@
           <w:sz w:val="20"/>
           <w:szCs w:val="20"/>
         </w:rPr>
-        <w:t>variance de trait de préférence de classe de diamètre du substrat saproxylique</w:t>
-      </w:r>
-    </w:p>
-    <w:p>
-      <w:pPr>
-        <w:rPr>
-          <w:sz w:val="20"/>
-          <w:szCs w:val="20"/>
-        </w:rPr>
-      </w:pPr>
+        <w:t xml:space="preserve">variance de trait de préférence de classe de diamètre du substrat </w:t>
+      </w:r>
+      <w:proofErr w:type="spellStart"/>
+      <w:r>
+        <w:rPr>
+          <w:sz w:val="20"/>
+          <w:szCs w:val="20"/>
+        </w:rPr>
+        <w:t>saproxylique</w:t>
+      </w:r>
+      <w:proofErr w:type="spellEnd"/>
+    </w:p>
+    <w:p>
+      <w:pPr>
+        <w:rPr>
+          <w:sz w:val="20"/>
+          <w:szCs w:val="20"/>
+        </w:rPr>
+      </w:pPr>
+      <w:proofErr w:type="spellStart"/>
+      <w:proofErr w:type="gramStart"/>
       <w:r>
         <w:rPr>
           <w:sz w:val="20"/>
@@ -2836,6 +3730,8 @@
         </w:rPr>
         <w:t>decay.niche</w:t>
       </w:r>
+      <w:proofErr w:type="spellEnd"/>
+      <w:proofErr w:type="gramEnd"/>
       <w:r>
         <w:rPr>
           <w:sz w:val="20"/>
@@ -2862,16 +3758,43 @@
           <w:sz w:val="20"/>
           <w:szCs w:val="20"/>
         </w:rPr>
-        <w:t>de préférence de stade de saproxylation du substrat saproxylique</w:t>
-      </w:r>
-    </w:p>
-    <w:p>
-      <w:pPr>
-        <w:rPr>
-          <w:sz w:val="20"/>
-          <w:szCs w:val="20"/>
-        </w:rPr>
-      </w:pPr>
+        <w:t xml:space="preserve">de préférence de stade de </w:t>
+      </w:r>
+      <w:proofErr w:type="spellStart"/>
+      <w:r>
+        <w:rPr>
+          <w:sz w:val="20"/>
+          <w:szCs w:val="20"/>
+        </w:rPr>
+        <w:t>saproxylation</w:t>
+      </w:r>
+      <w:proofErr w:type="spellEnd"/>
+      <w:r>
+        <w:rPr>
+          <w:sz w:val="20"/>
+          <w:szCs w:val="20"/>
+        </w:rPr>
+        <w:t xml:space="preserve"> du substrat </w:t>
+      </w:r>
+      <w:proofErr w:type="spellStart"/>
+      <w:r>
+        <w:rPr>
+          <w:sz w:val="20"/>
+          <w:szCs w:val="20"/>
+        </w:rPr>
+        <w:t>saproxylique</w:t>
+      </w:r>
+      <w:proofErr w:type="spellEnd"/>
+    </w:p>
+    <w:p>
+      <w:pPr>
+        <w:rPr>
+          <w:sz w:val="20"/>
+          <w:szCs w:val="20"/>
+        </w:rPr>
+      </w:pPr>
+      <w:proofErr w:type="spellStart"/>
+      <w:proofErr w:type="gramStart"/>
       <w:r>
         <w:rPr>
           <w:sz w:val="20"/>
@@ -2886,6 +3809,8 @@
         </w:rPr>
         <w:t>decay.niche</w:t>
       </w:r>
+      <w:proofErr w:type="spellEnd"/>
+      <w:proofErr w:type="gramEnd"/>
       <w:r>
         <w:rPr>
           <w:sz w:val="20"/>
@@ -2905,7 +3830,23 @@
           <w:sz w:val="20"/>
           <w:szCs w:val="20"/>
         </w:rPr>
-        <w:t>variance de trait de préférence de stade de saproxylation du substrat</w:t>
+        <w:t xml:space="preserve">variance de trait de préférence de stade de </w:t>
+      </w:r>
+      <w:proofErr w:type="spellStart"/>
+      <w:r>
+        <w:rPr>
+          <w:sz w:val="20"/>
+          <w:szCs w:val="20"/>
+        </w:rPr>
+        <w:t>saproxylation</w:t>
+      </w:r>
+      <w:proofErr w:type="spellEnd"/>
+      <w:r>
+        <w:rPr>
+          <w:sz w:val="20"/>
+          <w:szCs w:val="20"/>
+        </w:rPr>
+        <w:t xml:space="preserve"> du substrat</w:t>
       </w:r>
     </w:p>
     <w:p>
@@ -2959,8 +3900,17 @@
           <w:sz w:val="20"/>
           <w:szCs w:val="20"/>
         </w:rPr>
-        <w:t>Matrice espèces*sites*releves</w:t>
-      </w:r>
+        <w:t>Matrice espèces*sites*</w:t>
+      </w:r>
+      <w:proofErr w:type="spellStart"/>
+      <w:r>
+        <w:rPr>
+          <w:sz w:val="20"/>
+          <w:szCs w:val="20"/>
+        </w:rPr>
+        <w:t>releves</w:t>
+      </w:r>
+      <w:proofErr w:type="spellEnd"/>
     </w:p>
     <w:sectPr>
       <w:footerReference w:type="default" r:id="rId7"/>
@@ -3028,7 +3978,7 @@
           <w:rPr>
             <w:noProof/>
           </w:rPr>
-          <w:t>1</w:t>
+          <w:t>3</w:t>
         </w:r>
         <w:r>
           <w:fldChar w:fldCharType="end"/>

</xml_diff>